<commit_message>
fix(usp71): fix space tag bug in template 0 and merge local Celsis template changes
</commit_message>
<xml_diff>
--- a/Celsis OOS P1 template 0.docx
+++ b/Celsis OOS P1 template 0.docx
@@ -16747,6 +16747,7 @@
           <w:lang w:eastAsia="zh-CN"/>
         </w:rPr>
       </w:pPr>
+      <w:bookmarkStart w:id="22" w:name="OLE_LINK19"/>
     </w:p>
     <w:p>
       <w:pPr>
@@ -22858,6 +22859,7 @@
           </w:p>
         </w:tc>
       </w:tr>
+      <w:bookmarkEnd w:id="22"/>
     </w:tbl>
     <w:p>
       <w:pPr>
@@ -25930,6 +25932,12 @@
 </file>
 
 <file path=customXml/item1.xml><?xml version="1.0" encoding="utf-8"?>
+<p:properties xmlns:p="http://schemas.microsoft.com/office/2006/metadata/properties" xmlns:xsi="http://www.w3.org/2001/XMLSchema-instance" xmlns:pc="http://schemas.microsoft.com/office/infopath/2007/PartnerControls">
+  <documentManagement/>
+</p:properties>
+</file>
+
+<file path=customXml/item2.xml><?xml version="1.0" encoding="utf-8"?>
 <?mso-contentType ?>
 <FormTemplates xmlns="http://schemas.microsoft.com/sharepoint/v3/contenttype/forms">
   <Display>DocumentLibraryForm</Display>
@@ -25938,13 +25946,11 @@
 </FormTemplates>
 </file>
 
-<file path=customXml/item2.xml><?xml version="1.0" encoding="utf-8"?>
-<p:properties xmlns:p="http://schemas.microsoft.com/office/2006/metadata/properties" xmlns:xsi="http://www.w3.org/2001/XMLSchema-instance" xmlns:pc="http://schemas.microsoft.com/office/infopath/2007/PartnerControls">
-  <documentManagement/>
-</p:properties>
+<file path=customXml/item3.xml><?xml version="1.0" encoding="utf-8"?>
+<b:Sources xmlns:b="http://schemas.openxmlformats.org/officeDocument/2006/bibliography" xmlns="http://schemas.openxmlformats.org/officeDocument/2006/bibliography" SelectedStyle="\APA.XSL" StyleName="APA"/>
 </file>
 
-<file path=customXml/item3.xml><?xml version="1.0" encoding="utf-8"?>
+<file path=customXml/item4.xml><?xml version="1.0" encoding="utf-8"?>
 <ct:contentTypeSchema xmlns:ct="http://schemas.microsoft.com/office/2006/metadata/contentType" xmlns:ma="http://schemas.microsoft.com/office/2006/metadata/properties/metaAttributes" ct:_="" ma:_="" ma:contentTypeName="Document" ma:contentTypeID="0x010100FB737B7133867847B545A083BFAC78EF" ma:contentTypeVersion="12" ma:contentTypeDescription="Create a new document." ma:contentTypeScope="" ma:versionID="3a7982f5d2373b82eed64d91a9f1640e">
   <xsd:schema xmlns:xsd="http://www.w3.org/2001/XMLSchema" xmlns:xs="http://www.w3.org/2001/XMLSchema" xmlns:p="http://schemas.microsoft.com/office/2006/metadata/properties" xmlns:ns2="77e63d64-5ec0-4c26-bf73-c24d6b7abddf" xmlns:ns3="005d0a5f-c6b0-470f-85f2-ee975d36b3d6" targetNamespace="http://schemas.microsoft.com/office/2006/metadata/properties" ma:root="true" ma:fieldsID="2763948d00d98a9e1e6be9e3b1352800" ns2:_="" ns3:_="">
     <xsd:import namespace="77e63d64-5ec0-4c26-bf73-c24d6b7abddf"/>
@@ -26161,19 +26167,7 @@
 </ct:contentTypeSchema>
 </file>
 
-<file path=customXml/item4.xml><?xml version="1.0" encoding="utf-8"?>
-<b:Sources xmlns:b="http://schemas.openxmlformats.org/officeDocument/2006/bibliography" xmlns="http://schemas.openxmlformats.org/officeDocument/2006/bibliography" SelectedStyle="\APA.XSL" StyleName="APA"/>
-</file>
-
 <file path=customXml/itemProps1.xml><?xml version="1.0" encoding="utf-8"?>
-<ds:datastoreItem xmlns:ds="http://schemas.openxmlformats.org/officeDocument/2006/customXml" ds:itemID="{E711A312-DD48-45F6-BA88-B896F55D6DB7}">
-  <ds:schemaRefs>
-    <ds:schemaRef ds:uri="http://schemas.microsoft.com/sharepoint/v3/contenttype/forms"/>
-  </ds:schemaRefs>
-</ds:datastoreItem>
-</file>
-
-<file path=customXml/itemProps2.xml><?xml version="1.0" encoding="utf-8"?>
 <ds:datastoreItem xmlns:ds="http://schemas.openxmlformats.org/officeDocument/2006/customXml" ds:itemID="{DD86B631-EF59-42E0-AFBB-4D6A49D52145}">
   <ds:schemaRefs>
     <ds:schemaRef ds:uri="http://schemas.microsoft.com/office/2006/metadata/properties"/>
@@ -26182,7 +26176,23 @@
 </ds:datastoreItem>
 </file>
 
+<file path=customXml/itemProps2.xml><?xml version="1.0" encoding="utf-8"?>
+<ds:datastoreItem xmlns:ds="http://schemas.openxmlformats.org/officeDocument/2006/customXml" ds:itemID="{E711A312-DD48-45F6-BA88-B896F55D6DB7}">
+  <ds:schemaRefs>
+    <ds:schemaRef ds:uri="http://schemas.microsoft.com/sharepoint/v3/contenttype/forms"/>
+  </ds:schemaRefs>
+</ds:datastoreItem>
+</file>
+
 <file path=customXml/itemProps3.xml><?xml version="1.0" encoding="utf-8"?>
+<ds:datastoreItem xmlns:ds="http://schemas.openxmlformats.org/officeDocument/2006/customXml" ds:itemID="{308E1B35-0FAF-4A78-BEF3-82256463C83E}">
+  <ds:schemaRefs>
+    <ds:schemaRef ds:uri="http://schemas.openxmlformats.org/officeDocument/2006/bibliography"/>
+  </ds:schemaRefs>
+</ds:datastoreItem>
+</file>
+
+<file path=customXml/itemProps4.xml><?xml version="1.0" encoding="utf-8"?>
 <ds:datastoreItem xmlns:ds="http://schemas.openxmlformats.org/officeDocument/2006/customXml" ds:itemID="{F69EE333-7533-4C7F-8CBF-50CC15A694A4}">
   <ds:schemaRefs>
     <ds:schemaRef ds:uri="http://schemas.microsoft.com/office/2006/metadata/contentType"/>
@@ -26199,12 +26209,4 @@
     <ds:schemaRef ds:uri="http://schemas.microsoft.com/internal/obd"/>
   </ds:schemaRefs>
 </ds:datastoreItem>
-</file>
-
-<file path=customXml/itemProps4.xml><?xml version="1.0" encoding="utf-8"?>
-<ds:datastoreItem xmlns:ds="http://schemas.openxmlformats.org/officeDocument/2006/customXml" ds:itemID="{308E1B35-0FAF-4A78-BEF3-82256463C83E}">
-  <ds:schemaRefs>
-    <ds:schemaRef ds:uri="http://schemas.openxmlformats.org/officeDocument/2006/bibliography"/>
-  </ds:schemaRefs>
-</ds:datastoreItem>
 </file>
</xml_diff>